<commit_message>
docs: finalize E1 hardware audit and reproducibility
</commit_message>
<xml_diff>
--- a/exam/E1_REPORT.docx
+++ b/exam/E1_REPORT.docx
@@ -5066,59 +5066,10 @@
         <w:rPr>
           <w:b/>
         </w:rPr>
-        <w:t>Avvertenza di versioning:</w:t>
-      </w:r>
-      <w:r>
-        <w:t xml:space="preserve"> il </w:t>
-      </w:r>
-      <w:r>
-        <w:rPr>
-          <w:rFonts w:ascii="Consolas" w:hAnsi="Consolas"/>
-          <w:sz w:val="16"/>
-        </w:rPr>
-        <w:t>project_commit</w:t>
-      </w:r>
-      <w:r>
-        <w:t xml:space="preserve"> della campagna test Ubuntu è </w:t>
-      </w:r>
-      <w:r>
-        <w:rPr>
-          <w:rFonts w:ascii="Consolas" w:hAnsi="Consolas"/>
-          <w:sz w:val="16"/>
-        </w:rPr>
-        <w:t>f5bf86b237ca61f1d845732be41aa24203855921</w:t>
-      </w:r>
-      <w:r>
-        <w:t xml:space="preserve">, mentre il report Mac indica HEAD </w:t>
-      </w:r>
-      <w:r>
-        <w:rPr>
-          <w:rFonts w:ascii="Consolas" w:hAnsi="Consolas"/>
-          <w:sz w:val="16"/>
-        </w:rPr>
-        <w:t>59f556c</w:t>
-      </w:r>
-      <w:r>
-        <w:t xml:space="preserve">. L'identità dei byte di codice tra questi due commit </w:t>
-      </w:r>
-      <w:r>
-        <w:rPr>
-          <w:b/>
-        </w:rPr>
-        <w:t>non è stata ancora dimostrata</w:t>
-      </w:r>
-      <w:r>
-        <w:t xml:space="preserve">: prima di attribuire gli scostamenti al solo hardware è necessario verificare </w:t>
-      </w:r>
-      <w:r>
-        <w:rPr>
-          <w:rFonts w:ascii="Consolas" w:hAnsi="Consolas"/>
-          <w:sz w:val="16"/>
-        </w:rPr>
-        <w:t>git diff</w:t>
-      </w:r>
-      <w:r>
-        <w:t xml:space="preserve"> sulle sorgenti sperimentali. L'hash del runner Mac non è incluso nel materiale fornito. Le piccole differenze possono dipendere anche dalla variabilità di training non bitwise.</w:t>
+        <w:t xml:space="preserve">Aggiornamento audit 20/10/2026: </w:t>
+      </w:r>
+      <w:r>
+        <w:t>Fabrizio comunica diff nullo sui file sperimentali dei commit f5bf86b e 59f556c; l’output del diff non è allegato. Lo SHA-256 del runner E1 v2 è stato verificato nella copia di lavoro ed è a75aa3d844bb695a6d6155fe808394025b04c480d74d1e1b856eec5ca6f9c037. L’upstream, i pesi e gli split coincidono nei run_config originali; ciò non garantisce identità bitwise dei training.</w:t>
       </w:r>
     </w:p>
     <w:p>
@@ -6312,57 +6263,10 @@
         <w:rPr>
           <w:b/>
         </w:rPr>
-        <w:t>Non sono stati allegati</w:t>
-      </w:r>
-      <w:r>
-        <w:t xml:space="preserve"> il CSV riepilogativo della campagna di </w:t>
-      </w:r>
-      <w:r>
-        <w:rPr>
-          <w:b/>
-        </w:rPr>
-        <w:t>validation stand-alone Mac</w:t>
-      </w:r>
-      <w:r>
-        <w:t xml:space="preserve">, il relativo log completo, i manifest payload per singolo checkpoint e il </w:t>
-      </w:r>
-      <w:r>
-        <w:rPr>
-          <w:rFonts w:ascii="Consolas" w:hAnsi="Consolas"/>
-          <w:sz w:val="16"/>
-        </w:rPr>
-        <w:t>run_config.json</w:t>
-      </w:r>
-      <w:r>
-        <w:t xml:space="preserve"> della replica. Sono quindi attestati dal resoconto di Fabrizio, ma non verificabili direttamente tramite i tre file consegnati. La validation </w:t>
-      </w:r>
-      <w:r>
-        <w:rPr>
-          <w:b/>
-        </w:rPr>
-        <w:t>dentro</w:t>
-      </w:r>
-      <w:r>
-        <w:t xml:space="preserve"> la campagna test è invece documentata e verificata nei CSV. È opportuna una verifica di </w:t>
-      </w:r>
-      <w:r>
-        <w:rPr>
-          <w:rFonts w:ascii="Consolas" w:hAnsi="Consolas"/>
-          <w:sz w:val="16"/>
-        </w:rPr>
-        <w:t>git diff f5bf86b..59f556c -- scripts/ manifests/</w:t>
-      </w:r>
-      <w:r>
-        <w:t xml:space="preserve"> prima di definire la replica </w:t>
-      </w:r>
-      <w:r>
-        <w:rPr>
-          <w:i/>
-        </w:rPr>
-        <w:t>code-identical</w:t>
-      </w:r>
-      <w:r>
-        <w:t>.</w:t>
+        <w:t xml:space="preserve">Materiale successivamente ricevuto e verificato: </w:t>
+      </w:r>
+      <w:r>
+        <w:t>run_config.json per test e validation stand-alone, validation_standalone_summary.csv, payload_manifest_r00_x23.csv e mac_environment.txt. Sono stati rigenerati correttamente 403/403 SHA-256 di payload (3 train, 200 validation, 200 test). I per-run della validation separata e il manifest Ubuntu corrispondente non sono nel pacchetto ricevuto.</w:t>
       </w:r>
     </w:p>
     <w:p>
@@ -7372,6 +7276,753 @@
       </w:pPr>
       <w:r>
         <w:t>Fonte: riepiloghi CSV versionati per Ubuntu e replica Mac M4. I grafici sono rigenerabili da scripts/plot_e1_comparison.py.</w:t>
+      </w:r>
+    </w:p>
+    <w:p>
+      <w:r>
+        <w:br w:type="page"/>
+      </w:r>
+    </w:p>
+    <w:p>
+      <w:pPr>
+        <w:pStyle w:val="Heading1"/>
+      </w:pPr>
+      <w:r>
+        <w:t>Appendice A — Audit hardware e integrità dei risultati E1</w:t>
+      </w:r>
+    </w:p>
+    <w:p>
+      <w:pPr/>
+      <w:r>
+        <w:t>Aggiornamento 20 ottobre 2026. Questa appendice completa il report E1 pubblicato dopo la replica su Mac M4. Non introduce un nuovo test, non modifica gli split e non riaddestra alcun detector.</w:t>
+      </w:r>
+    </w:p>
+    <w:p>
+      <w:pPr>
+        <w:pStyle w:val="Heading2"/>
+      </w:pPr>
+      <w:r>
+        <w:t>A.1 Integrità delle sorgenti e del codice</w:t>
+      </w:r>
+    </w:p>
+    <w:tbl>
+      <w:tblPr>
+        <w:tblStyle w:val="LightShading-Accent1"/>
+        <w:tblW w:type="auto" w:w="0"/>
+        <w:tblLook w:firstColumn="1" w:firstRow="1" w:lastColumn="0" w:lastRow="0" w:noHBand="0" w:noVBand="1" w:val="04A0"/>
+      </w:tblPr>
+      <w:tblGrid>
+        <w:gridCol w:w="4831"/>
+        <w:gridCol w:w="4831"/>
+      </w:tblGrid>
+      <w:tr>
+        <w:tc>
+          <w:tcPr>
+            <w:tcW w:type="dxa" w:w="4831"/>
+            <w:vAlign w:val="center"/>
+          </w:tcPr>
+          <w:p>
+            <w:r>
+              <w:t>Verifica</w:t>
+            </w:r>
+          </w:p>
+        </w:tc>
+        <w:tc>
+          <w:tcPr>
+            <w:tcW w:type="dxa" w:w="4831"/>
+            <w:vAlign w:val="center"/>
+          </w:tcPr>
+          <w:p>
+            <w:r>
+              <w:t>Riscontro</w:t>
+            </w:r>
+          </w:p>
+        </w:tc>
+      </w:tr>
+      <w:tr>
+        <w:tc>
+          <w:tcPr>
+            <w:tcW w:type="dxa" w:w="4831"/>
+            <w:vAlign w:val="center"/>
+          </w:tcPr>
+          <w:p>
+            <w:r>
+              <w:t>Codice runner</w:t>
+            </w:r>
+          </w:p>
+        </w:tc>
+        <w:tc>
+          <w:tcPr>
+            <w:tcW w:type="dxa" w:w="4831"/>
+            <w:vAlign w:val="center"/>
+          </w:tcPr>
+          <w:p>
+            <w:r>
+              <w:t>SHA-256 verificato: a75aa3d844bb695a6d6155fe808394025b04c480d74d1e1b856eec5ca6f9c037. Diff dei file esecutivi riferito nullo da Fabrizio; output non allegato.</w:t>
+            </w:r>
+          </w:p>
+        </w:tc>
+      </w:tr>
+      <w:tr>
+        <w:tc>
+          <w:tcPr>
+            <w:tcW w:type="dxa" w:w="4831"/>
+            <w:vAlign w:val="center"/>
+          </w:tcPr>
+          <w:p>
+            <w:r>
+              <w:t>Configurazioni</w:t>
+            </w:r>
+          </w:p>
+        </w:tc>
+        <w:tc>
+          <w:tcPr>
+            <w:tcW w:type="dxa" w:w="4831"/>
+            <w:vAlign w:val="center"/>
+          </w:tcPr>
+          <w:p>
+            <w:r>
+              <w:t>Mac test e validation: stessi seed, X, split SHA, pesi SHA, submodule e schema payload dell’esperimento Ubuntu.</w:t>
+            </w:r>
+          </w:p>
+        </w:tc>
+      </w:tr>
+      <w:tr>
+        <w:tc>
+          <w:tcPr>
+            <w:tcW w:type="dxa" w:w="4831"/>
+            <w:vAlign w:val="center"/>
+          </w:tcPr>
+          <w:p>
+            <w:r>
+              <w:t>Payload manifest</w:t>
+            </w:r>
+          </w:p>
+        </w:tc>
+        <w:tc>
+          <w:tcPr>
+            <w:tcW w:type="dxa" w:w="4831"/>
+            <w:vAlign w:val="center"/>
+          </w:tcPr>
+          <w:p>
+            <w:r>
+              <w:t>403/403 hash ricreati: repeat 0, X23, 3 train + 200 validation + 200 test.</w:t>
+            </w:r>
+          </w:p>
+        </w:tc>
+      </w:tr>
+      <w:tr>
+        <w:tc>
+          <w:tcPr>
+            <w:tcW w:type="dxa" w:w="4831"/>
+            <w:vAlign w:val="center"/>
+          </w:tcPr>
+          <w:p>
+            <w:r>
+              <w:t>Validation Mac autonoma</w:t>
+            </w:r>
+          </w:p>
+        </w:tc>
+        <w:tc>
+          <w:tcPr>
+            <w:tcW w:type="dxa" w:w="4831"/>
+            <w:vAlign w:val="center"/>
+          </w:tcPr>
+          <w:p>
+            <w:r>
+              <w:t>16 righe summary, n=10 dichiarati per combinazione; AUROC centroid X23 = 0,882700.</w:t>
+            </w:r>
+          </w:p>
+        </w:tc>
+      </w:tr>
+      <w:tr>
+        <w:tc>
+          <w:tcPr>
+            <w:tcW w:type="dxa" w:w="4831"/>
+            <w:vAlign w:val="center"/>
+          </w:tcPr>
+          <w:p>
+            <w:r>
+              <w:t>Ambiente Mac</w:t>
+            </w:r>
+          </w:p>
+        </w:tc>
+        <w:tc>
+          <w:tcPr>
+            <w:tcW w:type="dxa" w:w="4831"/>
+            <w:vAlign w:val="center"/>
+          </w:tcPr>
+          <w:p>
+            <w:r>
+              <w:t>Apple M4 ARM64, 10 core (4P+6E), 16 GB RAM, macOS 27.0.1; raccolta delle versioni software incompleta per errori shell.</w:t>
+            </w:r>
+          </w:p>
+        </w:tc>
+      </w:tr>
+    </w:tbl>
+    <w:p>
+      <w:pPr>
+        <w:pStyle w:val="Heading2"/>
+      </w:pPr>
+      <w:r>
+        <w:t>A.2 Prestazioni del detector: due piattaforme</w:t>
+      </w:r>
+    </w:p>
+    <w:tbl>
+      <w:tblPr>
+        <w:tblStyle w:val="LightShading-Accent1"/>
+        <w:tblW w:type="auto" w:w="0"/>
+        <w:tblLook w:firstColumn="1" w:firstRow="1" w:lastColumn="0" w:lastRow="0" w:noHBand="0" w:noVBand="1" w:val="04A0"/>
+      </w:tblPr>
+      <w:tblGrid>
+        <w:gridCol w:w="2416"/>
+        <w:gridCol w:w="2416"/>
+        <w:gridCol w:w="2416"/>
+        <w:gridCol w:w="2416"/>
+      </w:tblGrid>
+      <w:tr>
+        <w:tc>
+          <w:tcPr>
+            <w:tcW w:type="dxa" w:w="2416"/>
+          </w:tcPr>
+          <w:p>
+            <w:r>
+              <w:t>X-LSB</w:t>
+            </w:r>
+          </w:p>
+        </w:tc>
+        <w:tc>
+          <w:tcPr>
+            <w:tcW w:type="dxa" w:w="2416"/>
+          </w:tcPr>
+          <w:p>
+            <w:r>
+              <w:t>AUROC Ubuntu</w:t>
+            </w:r>
+          </w:p>
+        </w:tc>
+        <w:tc>
+          <w:tcPr>
+            <w:tcW w:type="dxa" w:w="2416"/>
+          </w:tcPr>
+          <w:p>
+            <w:r>
+              <w:t>AUROC Mac</w:t>
+            </w:r>
+          </w:p>
+        </w:tc>
+        <w:tc>
+          <w:tcPr>
+            <w:tcW w:type="dxa" w:w="2416"/>
+          </w:tcPr>
+          <w:p>
+            <w:r>
+              <w:t>Mac - Ubuntu</w:t>
+            </w:r>
+          </w:p>
+        </w:tc>
+      </w:tr>
+      <w:tr>
+        <w:tc>
+          <w:tcPr>
+            <w:tcW w:type="dxa" w:w="2416"/>
+          </w:tcPr>
+          <w:p>
+            <w:r>
+              <w:t>1</w:t>
+            </w:r>
+          </w:p>
+        </w:tc>
+        <w:tc>
+          <w:tcPr>
+            <w:tcW w:type="dxa" w:w="2416"/>
+          </w:tcPr>
+          <w:p>
+            <w:r>
+              <w:t>0.500150</w:t>
+            </w:r>
+          </w:p>
+        </w:tc>
+        <w:tc>
+          <w:tcPr>
+            <w:tcW w:type="dxa" w:w="2416"/>
+          </w:tcPr>
+          <w:p>
+            <w:r>
+              <w:t>0.500209</w:t>
+            </w:r>
+          </w:p>
+        </w:tc>
+        <w:tc>
+          <w:tcPr>
+            <w:tcW w:type="dxa" w:w="2416"/>
+          </w:tcPr>
+          <w:p>
+            <w:r>
+              <w:t>+0.000059</w:t>
+            </w:r>
+          </w:p>
+        </w:tc>
+      </w:tr>
+      <w:tr>
+        <w:tc>
+          <w:tcPr>
+            <w:tcW w:type="dxa" w:w="2416"/>
+          </w:tcPr>
+          <w:p>
+            <w:r>
+              <w:t>8</w:t>
+            </w:r>
+          </w:p>
+        </w:tc>
+        <w:tc>
+          <w:tcPr>
+            <w:tcW w:type="dxa" w:w="2416"/>
+          </w:tcPr>
+          <w:p>
+            <w:r>
+              <w:t>0.508232</w:t>
+            </w:r>
+          </w:p>
+        </w:tc>
+        <w:tc>
+          <w:tcPr>
+            <w:tcW w:type="dxa" w:w="2416"/>
+          </w:tcPr>
+          <w:p>
+            <w:r>
+              <w:t>0.509388</w:t>
+            </w:r>
+          </w:p>
+        </w:tc>
+        <w:tc>
+          <w:tcPr>
+            <w:tcW w:type="dxa" w:w="2416"/>
+          </w:tcPr>
+          <w:p>
+            <w:r>
+              <w:t>+0.001156</w:t>
+            </w:r>
+          </w:p>
+        </w:tc>
+      </w:tr>
+      <w:tr>
+        <w:tc>
+          <w:tcPr>
+            <w:tcW w:type="dxa" w:w="2416"/>
+          </w:tcPr>
+          <w:p>
+            <w:r>
+              <w:t>16</w:t>
+            </w:r>
+          </w:p>
+        </w:tc>
+        <w:tc>
+          <w:tcPr>
+            <w:tcW w:type="dxa" w:w="2416"/>
+          </w:tcPr>
+          <w:p>
+            <w:r>
+              <w:t>0.501293</w:t>
+            </w:r>
+          </w:p>
+        </w:tc>
+        <w:tc>
+          <w:tcPr>
+            <w:tcW w:type="dxa" w:w="2416"/>
+          </w:tcPr>
+          <w:p>
+            <w:r>
+              <w:t>0.501425</w:t>
+            </w:r>
+          </w:p>
+        </w:tc>
+        <w:tc>
+          <w:tcPr>
+            <w:tcW w:type="dxa" w:w="2416"/>
+          </w:tcPr>
+          <w:p>
+            <w:r>
+              <w:t>+0.000132</w:t>
+            </w:r>
+          </w:p>
+        </w:tc>
+      </w:tr>
+      <w:tr>
+        <w:tc>
+          <w:tcPr>
+            <w:tcW w:type="dxa" w:w="2416"/>
+          </w:tcPr>
+          <w:p>
+            <w:r>
+              <w:t>23</w:t>
+            </w:r>
+          </w:p>
+        </w:tc>
+        <w:tc>
+          <w:tcPr>
+            <w:tcW w:type="dxa" w:w="2416"/>
+          </w:tcPr>
+          <w:p>
+            <w:r>
+              <w:t>0.901863</w:t>
+            </w:r>
+          </w:p>
+        </w:tc>
+        <w:tc>
+          <w:tcPr>
+            <w:tcW w:type="dxa" w:w="2416"/>
+          </w:tcPr>
+          <w:p>
+            <w:r>
+              <w:t>0.904378</w:t>
+            </w:r>
+          </w:p>
+        </w:tc>
+        <w:tc>
+          <w:tcPr>
+            <w:tcW w:type="dxa" w:w="2416"/>
+          </w:tcPr>
+          <w:p>
+            <w:r>
+              <w:t>+0.002515</w:t>
+            </w:r>
+          </w:p>
+        </w:tc>
+      </w:tr>
+    </w:tbl>
+    <w:p>
+      <w:r>
+        <w:t>A X23, la differenza delle medie AUROC è +0,0025145 (Mac−Ubuntu). Sono medie su 10 fit per X; non rappresentano una prova di equivalenza statistica, né un test su nuove architetture CNN.</w:t>
+      </w:r>
+    </w:p>
+    <w:p>
+      <w:pPr>
+        <w:jc w:val="center"/>
+      </w:pPr>
+      <w:r>
+        <w:drawing>
+          <wp:inline xmlns:a="http://schemas.openxmlformats.org/drawingml/2006/main" xmlns:pic="http://schemas.openxmlformats.org/drawingml/2006/picture">
+            <wp:extent cx="5472000" cy="3136391"/>
+            <wp:docPr id="6" name="Picture 6"/>
+            <wp:cNvGraphicFramePr>
+              <a:graphicFrameLocks noChangeAspect="1"/>
+            </wp:cNvGraphicFramePr>
+            <a:graphic>
+              <a:graphicData uri="http://schemas.openxmlformats.org/drawingml/2006/picture">
+                <pic:pic>
+                  <pic:nvPicPr>
+                    <pic:cNvPr id="0" name="e1_hw_auroc_comparison.png"/>
+                    <pic:cNvPicPr/>
+                  </pic:nvPicPr>
+                  <pic:blipFill>
+                    <a:blip r:embed="rId16"/>
+                    <a:stretch>
+                      <a:fillRect/>
+                    </a:stretch>
+                  </pic:blipFill>
+                  <pic:spPr>
+                    <a:xfrm>
+                      <a:off x="0" y="0"/>
+                      <a:ext cx="5472000" cy="3136391"/>
+                    </a:xfrm>
+                    <a:prstGeom prst="rect"/>
+                  </pic:spPr>
+                </pic:pic>
+              </a:graphicData>
+            </a:graphic>
+          </wp:inline>
+        </w:drawing>
+      </w:r>
+    </w:p>
+    <w:p>
+      <w:pPr>
+        <w:pStyle w:val="Caption"/>
+      </w:pPr>
+      <w:r>
+        <w:t>Figura A1. AUROC del classificatore centroid in funzione dell’intensità LSB: Ubuntu virtualizzato e Mac M4 CPU.</w:t>
+      </w:r>
+    </w:p>
+    <w:p>
+      <w:pPr>
+        <w:pStyle w:val="Heading2"/>
+      </w:pPr>
+      <w:r>
+        <w:t>A.3 Analisi dei tempi storici</w:t>
+      </w:r>
+    </w:p>
+    <w:tbl>
+      <w:tblPr>
+        <w:tblStyle w:val="LightShading-Accent1"/>
+        <w:tblW w:type="auto" w:w="0"/>
+        <w:tblLook w:firstColumn="1" w:firstRow="1" w:lastColumn="0" w:lastRow="0" w:noHBand="0" w:noVBand="1" w:val="04A0"/>
+      </w:tblPr>
+      <w:tblGrid>
+        <w:gridCol w:w="3221"/>
+        <w:gridCol w:w="3221"/>
+        <w:gridCol w:w="3221"/>
+      </w:tblGrid>
+      <w:tr>
+        <w:tc>
+          <w:tcPr>
+            <w:tcW w:type="dxa" w:w="3221"/>
+          </w:tcPr>
+          <w:p>
+            <w:r>
+              <w:t>Indicatore</w:t>
+            </w:r>
+          </w:p>
+        </w:tc>
+        <w:tc>
+          <w:tcPr>
+            <w:tcW w:type="dxa" w:w="3221"/>
+          </w:tcPr>
+          <w:p>
+            <w:r>
+              <w:t>Ubuntu VirtualBox</w:t>
+            </w:r>
+          </w:p>
+        </w:tc>
+        <w:tc>
+          <w:tcPr>
+            <w:tcW w:type="dxa" w:w="3221"/>
+          </w:tcPr>
+          <w:p>
+            <w:r>
+              <w:t>Mac M4 CPU</w:t>
+            </w:r>
+          </w:p>
+        </w:tc>
+      </w:tr>
+      <w:tr>
+        <w:tc>
+          <w:tcPr>
+            <w:tcW w:type="dxa" w:w="3221"/>
+          </w:tcPr>
+          <w:p>
+            <w:r>
+              <w:t>Fit distinti</w:t>
+            </w:r>
+          </w:p>
+        </w:tc>
+        <w:tc>
+          <w:tcPr>
+            <w:tcW w:type="dxa" w:w="3221"/>
+          </w:tcPr>
+          <w:p>
+            <w:r>
+              <w:t>40</w:t>
+            </w:r>
+          </w:p>
+        </w:tc>
+        <w:tc>
+          <w:tcPr>
+            <w:tcW w:type="dxa" w:w="3221"/>
+          </w:tcPr>
+          <w:p>
+            <w:r>
+              <w:t>40</w:t>
+            </w:r>
+          </w:p>
+        </w:tc>
+      </w:tr>
+      <w:tr>
+        <w:tc>
+          <w:tcPr>
+            <w:tcW w:type="dxa" w:w="3221"/>
+          </w:tcPr>
+          <w:p>
+            <w:r>
+              <w:t>elapsed_sec medio/fit</w:t>
+            </w:r>
+          </w:p>
+        </w:tc>
+        <w:tc>
+          <w:tcPr>
+            <w:tcW w:type="dxa" w:w="3221"/>
+          </w:tcPr>
+          <w:p>
+            <w:r>
+              <w:t>217,124 s</w:t>
+            </w:r>
+          </w:p>
+        </w:tc>
+        <w:tc>
+          <w:tcPr>
+            <w:tcW w:type="dxa" w:w="3221"/>
+          </w:tcPr>
+          <w:p>
+            <w:r>
+              <w:t>104,412 s</w:t>
+            </w:r>
+          </w:p>
+        </w:tc>
+      </w:tr>
+      <w:tr>
+        <w:tc>
+          <w:tcPr>
+            <w:tcW w:type="dxa" w:w="3221"/>
+          </w:tcPr>
+          <w:p>
+            <w:r>
+              <w:t>Totale intervalli misurati</w:t>
+            </w:r>
+          </w:p>
+        </w:tc>
+        <w:tc>
+          <w:tcPr>
+            <w:tcW w:type="dxa" w:w="3221"/>
+          </w:tcPr>
+          <w:p>
+            <w:r>
+              <w:t>~144,75 min</w:t>
+            </w:r>
+          </w:p>
+        </w:tc>
+        <w:tc>
+          <w:tcPr>
+            <w:tcW w:type="dxa" w:w="3221"/>
+          </w:tcPr>
+          <w:p>
+            <w:r>
+              <w:t>~69,61 min</w:t>
+            </w:r>
+          </w:p>
+        </w:tc>
+      </w:tr>
+      <w:tr>
+        <w:tc>
+          <w:tcPr>
+            <w:tcW w:type="dxa" w:w="3221"/>
+          </w:tcPr>
+          <w:p>
+            <w:r>
+              <w:t>Wall-clock completo</w:t>
+            </w:r>
+          </w:p>
+        </w:tc>
+        <w:tc>
+          <w:tcPr>
+            <w:tcW w:type="dxa" w:w="3221"/>
+          </w:tcPr>
+          <w:p>
+            <w:r>
+              <w:t>Non disponibile</w:t>
+            </w:r>
+          </w:p>
+        </w:tc>
+        <w:tc>
+          <w:tcPr>
+            <w:tcW w:type="dxa" w:w="3221"/>
+          </w:tcPr>
+          <w:p>
+            <w:r>
+              <w:t>Non disponibile</w:t>
+            </w:r>
+          </w:p>
+        </w:tc>
+      </w:tr>
+      <w:tr>
+        <w:tc>
+          <w:tcPr>
+            <w:tcW w:type="dxa" w:w="3221"/>
+          </w:tcPr>
+          <w:p>
+            <w:r>
+              <w:t>Picco RAM comparabile</w:t>
+            </w:r>
+          </w:p>
+        </w:tc>
+        <w:tc>
+          <w:tcPr>
+            <w:tcW w:type="dxa" w:w="3221"/>
+          </w:tcPr>
+          <w:p>
+            <w:r>
+              <w:t>Non disponibile</w:t>
+            </w:r>
+          </w:p>
+        </w:tc>
+        <w:tc>
+          <w:tcPr>
+            <w:tcW w:type="dxa" w:w="3221"/>
+          </w:tcPr>
+          <w:p>
+            <w:r>
+              <w:t>Non disponibile</w:t>
+            </w:r>
+          </w:p>
+        </w:tc>
+      </w:tr>
+    </w:tbl>
+    <w:p>
+      <w:r>
+        <w:t>Rapporto delle medie del tratto cronometrato Ubuntu/Mac: 2,079. L’informazione proviene dall’audit locale Ubuntu già eseguito e dal CSV Mac. Il tempo include una parte del fitting/valutazione, ma esclude avvio Python e preparazioni. La VM e il Mac differiscono anche per virtualizzazione, OS, RAM, build TensorFlow e threading: non è corretto attribuire questa differenza esclusivamente alla CPU M4.</w:t>
+      </w:r>
+    </w:p>
+    <w:p>
+      <w:pPr>
+        <w:jc w:val="center"/>
+      </w:pPr>
+      <w:r>
+        <w:drawing>
+          <wp:inline xmlns:a="http://schemas.openxmlformats.org/drawingml/2006/main" xmlns:pic="http://schemas.openxmlformats.org/drawingml/2006/picture">
+            <wp:extent cx="5292000" cy="2904147"/>
+            <wp:docPr id="7" name="Picture 7"/>
+            <wp:cNvGraphicFramePr>
+              <a:graphicFrameLocks noChangeAspect="1"/>
+            </wp:cNvGraphicFramePr>
+            <a:graphic>
+              <a:graphicData uri="http://schemas.openxmlformats.org/drawingml/2006/picture">
+                <pic:pic>
+                  <pic:nvPicPr>
+                    <pic:cNvPr id="0" name="e1_hw_mac_elapsed_by_x.png"/>
+                    <pic:cNvPicPr/>
+                  </pic:nvPicPr>
+                  <pic:blipFill>
+                    <a:blip r:embed="rId17"/>
+                    <a:stretch>
+                      <a:fillRect/>
+                    </a:stretch>
+                  </pic:blipFill>
+                  <pic:spPr>
+                    <a:xfrm>
+                      <a:off x="0" y="0"/>
+                      <a:ext cx="5292000" cy="2904147"/>
+                    </a:xfrm>
+                    <a:prstGeom prst="rect"/>
+                  </pic:spPr>
+                </pic:pic>
+              </a:graphicData>
+            </a:graphic>
+          </wp:inline>
+        </w:drawing>
+      </w:r>
+    </w:p>
+    <w:p>
+      <w:pPr>
+        <w:pStyle w:val="Caption"/>
+      </w:pPr>
+      <w:r>
+        <w:t>Figura A2. Tempi medi Mac per X con deviazione standard sui 10 fit distinti.</w:t>
+      </w:r>
+    </w:p>
+    <w:p>
+      <w:pPr>
+        <w:pStyle w:val="Heading2"/>
+      </w:pPr>
+      <w:r>
+        <w:t>A.4 Materiali e decisione operativa</w:t>
+      </w:r>
+    </w:p>
+    <w:p>
+      <w:r>
+        <w:t>Le fonti originali della replica Mac sono conservate in results/replicas/e1_mac_m4/, con l’audit integrativo nella sottocartella audit/. Il workbook E1_grafici.xlsx include ora Audit_hardware e Mac_val_standalone. Lo script audit_e1_platforms.py è già stato eseguito su Ubuntu: la tabella per-run paired resta recuperabile localmente, senza training, per eventuali grafici di dispersione aggiuntivi.</w:t>
+      </w:r>
+    </w:p>
+    <w:p>
+      <w:r>
+        <w:t>CONCLUSIONE. E1 resta chiuso nel perimetro di misurazione in-distribution. L’audit mostra riproducibilità qualitativa e integrità dei payload, ma non equivalenza bitwise, validità OOD o benchmark hardware causale. La progettazione di E2 può cominciare senza ripetere la campagna E1.</w:t>
       </w:r>
     </w:p>
     <w:sectPr>
@@ -7856,7 +8507,7 @@
       <w:rFonts w:asciiTheme="majorHAnsi" w:eastAsiaTheme="majorEastAsia" w:hAnsiTheme="majorHAnsi" w:cstheme="majorBidi" w:ascii="Aptos Display" w:hAnsi="Aptos Display"/>
       <w:b/>
       <w:bCs/>
-      <w:color w:val="123052"/>
+      <w:color w:val="153952"/>
       <w:sz w:val="30"/>
       <w:szCs w:val="28"/>
     </w:rPr>
@@ -7880,7 +8531,7 @@
       <w:rFonts w:asciiTheme="majorHAnsi" w:eastAsiaTheme="majorEastAsia" w:hAnsiTheme="majorHAnsi" w:cstheme="majorBidi" w:ascii="Aptos Display" w:hAnsi="Aptos Display"/>
       <w:b/>
       <w:bCs/>
-      <w:color w:val="123052"/>
+      <w:color w:val="106569"/>
       <w:sz w:val="24"/>
       <w:szCs w:val="26"/>
     </w:rPr>

</xml_diff>